<commit_message>
docs: add comparison with Jev and the open-weight ecosystem
- Jev (TypeSafe AI) is closed-weight; its parameter count has never been disclosed
- Its docs explicitly state it is not fine-tuned or LoRA-adapted with customer data,
  which is why this work uses open-weight models of the same paradigm
- Add a size/score table across Jev, Baset Labs and OmniJev models
- Note that Jev Decision Index is a 37-benchmark composite, not comparable to
  the public-231 accuracy reported here
</commit_message>
<xml_diff>
--- a/docs/tech-report.docx
+++ b/docs/tech-report.docx
@@ -247,6 +247,20 @@
           <w:sz w:val="21"/>
         </w:rPr>
         <w:t>基线为 Baset Labs 的 elephant-1（9B，Qwen3.5-9B 全量微调而来，答案槽位读出口径为 slot_lm、注意力为 block-bidirectional）。上限参照为同系列的 mammoth-1（27B）。另有 Strands 的 Decider-2B 作为小模型参照。三者均以本机 bf16 自托管推理。</w:t>
+      </w:r>
+    </w:p>
+    <w:p>
+      <w:pPr>
+        <w:spacing w:after="120" w:line="336" w:lineRule="auto"/>
+        <w:ind w:firstLine="420"/>
+      </w:pPr>
+      <w:r>
+        <w:rPr>
+          <w:rFonts w:ascii="宋体" w:hAnsi="宋体" w:eastAsia="宋体"/>
+          <w:b w:val="0"/>
+          <w:sz w:val="21"/>
+        </w:rPr>
+        <w:t>需要说明与 Jev 的关系。Jev 是 TypeSafe AI 的闭源模型，官方从未公开其参数量，仅通过 API 提供服务，且文档明确指出它不接受针对客户数据的微调或 LoRA 适配。因此它无法作为本项目的微调对象，本文所用的是同范式的开源实现。截至 2026 年 10 月，Jev Decision Index 榜单上 Jev 得 60.2 分，低于多个开源 27B 模型（榜首 71.5），同生态的 OneJev 系列（0.8B/4B/9B/27B）分别为 29.0/49.2/53.3/59.9，规模与得分大致单调。这说明该范式的可训练能力目前主要承载于开源权重之上。</w:t>
       </w:r>
     </w:p>
     <w:p>

</xml_diff>

<commit_message>
feat: threshold/precision-coverage figure + wire it into README and report
- new docs/figures/threshold_curves.png: two panels, easy vs hard traffic,
  precision on the adopted subset against coverage, 98% target line, hollow
  markers at the 0.9 default, and a box listing the threshold each model needs
  for 98% precision
- threshold_advice.py now also exports results/threshold_curves.csv (801 rows)
  so the figure is generated from data rather than transcribed
- src/analysis/plot_threshold.py reads that CSV; curves below 30 adopted
  samples are dropped because precision there is pure noise
- README: figure embedded in the deployment section; report: 图 2 in 4.8
</commit_message>
<xml_diff>
--- a/docs/tech-report.docx
+++ b/docs/tech-report.docx
@@ -8001,6 +8001,59 @@
           <w:sz w:val="21"/>
         </w:rPr>
         <w:t>——任何阈值下都达不到，基线则可以（0.990 / 35.0%）。这是「调阈值」与「模型不行」的分界：前者可以靠调参数解决，后者不能。</w:t>
+      </w:r>
+    </w:p>
+    <w:p>
+      <w:pPr>
+        <w:jc w:val="center"/>
+      </w:pPr>
+      <w:r>
+        <w:drawing>
+          <wp:inline xmlns:a="http://schemas.openxmlformats.org/drawingml/2006/main" xmlns:pic="http://schemas.openxmlformats.org/drawingml/2006/picture">
+            <wp:extent cx="5616000" cy="2613938"/>
+            <wp:docPr id="2" name="Picture 2"/>
+            <wp:cNvGraphicFramePr>
+              <a:graphicFrameLocks noChangeAspect="1"/>
+            </wp:cNvGraphicFramePr>
+            <a:graphic>
+              <a:graphicData uri="http://schemas.openxmlformats.org/drawingml/2006/picture">
+                <pic:pic>
+                  <pic:nvPicPr>
+                    <pic:cNvPr id="0" name="threshold_curves.png"/>
+                    <pic:cNvPicPr/>
+                  </pic:nvPicPr>
+                  <pic:blipFill>
+                    <a:blip r:embed="rId10"/>
+                    <a:stretch>
+                      <a:fillRect/>
+                    </a:stretch>
+                  </pic:blipFill>
+                  <pic:spPr>
+                    <a:xfrm>
+                      <a:off x="0" y="0"/>
+                      <a:ext cx="5616000" cy="2613938"/>
+                    </a:xfrm>
+                    <a:prstGeom prst="rect"/>
+                  </pic:spPr>
+                </pic:pic>
+              </a:graphicData>
+            </a:graphic>
+          </wp:inline>
+        </w:drawing>
+      </w:r>
+    </w:p>
+    <w:p>
+      <w:pPr>
+        <w:spacing w:after="200"/>
+        <w:jc w:val="center"/>
+      </w:pPr>
+      <w:r>
+        <w:rPr>
+          <w:rFonts w:ascii="宋体" w:hAnsi="宋体" w:eastAsia="宋体"/>
+          <w:b w:val="0"/>
+          <w:sz w:val="18"/>
+        </w:rPr>
+        <w:t>图 2  阈值-精度曲线：同一阈值在两种流量上的含义完全不同。空心标记为 0.9 工作点；两个面板横轴范围不同，不可跨面板比水平位置</w:t>
       </w:r>
     </w:p>
     <w:p>

</xml_diff>